<commit_message>
feat: agregar soporte NeoPixel WS2812 (8 LEDs, GPIO 10 SPI)
- lib/leds.js: servicio modular con init/on/off/cleanup, lazy-load para dev en Windows
- server.js: inicializa LEDs al boot (azul suave) y cleanup en SIGTERM/SIGINT
- Instructivo.docx: sección 15 con cableado, pin, librería y funciones

Co-Authored-By: Claude Sonnet 4.6 <noreply@anthropic.com>
</commit_message>
<xml_diff>
--- a/Instructivo.docx
+++ b/Instructivo.docx
@@ -152,14 +152,6 @@
         <w:pStyle w:val="Listaconvietas"/>
       </w:pPr>
       <w:r>
-        <w:t>10. Cableado (INMP441 + MAX98357A)</w:t>
-      </w:r>
-    </w:p>
-    <w:p>
-      <w:pPr>
-        <w:pStyle w:val="Listaconvietas"/>
-      </w:pPr>
-      <w:r>
         <w:t>11. Configuración I2S (mic + speaker)</w:t>
       </w:r>
     </w:p>
@@ -2486,28 +2478,6 @@
           <w:lang w:val="es-AR"/>
         </w:rPr>
         <w:t>Guardar:  Ctrl+O → Enter → Ctrl+X</w:t>
-      </w:r>
-    </w:p>
-    <w:p>
-      <w:pPr>
-        <w:pStyle w:val="Ttulo1"/>
-        <w:rPr>
-          <w:lang w:val="es-AR"/>
-        </w:rPr>
-      </w:pPr>
-      <w:r>
-        <w:rPr>
-          <w:color w:val="1F3A5F"/>
-          <w:lang w:val="es-AR"/>
-        </w:rPr>
-        <w:t xml:space="preserve">10. Cableado (INMP441 + </w:t>
-      </w:r>
-      <w:r>
-        <w:rPr>
-          <w:color w:val="1F3A5F"/>
-          <w:lang w:val="es-AR"/>
-        </w:rPr>
-        <w:t>MAX98357A)</w:t>
       </w:r>
     </w:p>
     <w:p>
@@ -3499,6 +3469,19 @@
     </w:p>
     <w:p>
       <w:pPr>
+        <w:rPr>
+          <w:lang w:val="es-AR"/>
+        </w:rPr>
+      </w:pPr>
+      <w:r>
+        <w:rPr>
+          <w:lang w:val="es-AR"/>
+        </w:rPr>
+        <w:t>Esperar 1 minuto y volver a conectar por SSH:</w:t>
+      </w:r>
+    </w:p>
+    <w:p>
+      <w:pPr>
         <w:ind w:left="283"/>
         <w:rPr>
           <w:lang w:val="es-AR"/>
@@ -3511,20 +3494,35 @@
           <w:sz w:val="20"/>
           <w:lang w:val="es-AR"/>
         </w:rPr>
-        <w:t>sudo reboot</w:t>
-      </w:r>
-    </w:p>
-    <w:p>
-      <w:pPr>
-        <w:rPr>
-          <w:lang w:val="es-AR"/>
-        </w:rPr>
-      </w:pPr>
-      <w:r>
-        <w:rPr>
-          <w:lang w:val="es-AR"/>
-        </w:rPr>
-        <w:t>Esperar 1 minuto y volver a conectar por SSH:</w:t>
+        <w:t>ssh brumelab@brumexa.local</w:t>
+      </w:r>
+    </w:p>
+    <w:p>
+      <w:pPr>
+        <w:pStyle w:val="Ttulo1"/>
+        <w:rPr>
+          <w:lang w:val="es-AR"/>
+        </w:rPr>
+      </w:pPr>
+      <w:r>
+        <w:rPr>
+          <w:color w:val="1F3A5F"/>
+          <w:lang w:val="es-AR"/>
+        </w:rPr>
+        <w:t>12. Verificación de audio</w:t>
+      </w:r>
+    </w:p>
+    <w:p>
+      <w:pPr>
+        <w:rPr>
+          <w:lang w:val="es-AR"/>
+        </w:rPr>
+      </w:pPr>
+      <w:r>
+        <w:rPr>
+          <w:lang w:val="es-AR"/>
+        </w:rPr>
+        <w:t>Recién ahora sí — verificar que el micrófono y el speaker están detectados:</w:t>
       </w:r>
     </w:p>
     <w:p>
@@ -3541,35 +3539,7 @@
           <w:sz w:val="20"/>
           <w:lang w:val="es-AR"/>
         </w:rPr>
-        <w:t>ssh brumelab@brumexa.local</w:t>
-      </w:r>
-    </w:p>
-    <w:p>
-      <w:pPr>
-        <w:pStyle w:val="Ttulo1"/>
-        <w:rPr>
-          <w:lang w:val="es-AR"/>
-        </w:rPr>
-      </w:pPr>
-      <w:r>
-        <w:rPr>
-          <w:color w:val="1F3A5F"/>
-          <w:lang w:val="es-AR"/>
-        </w:rPr>
-        <w:t>12. Verificación de audio</w:t>
-      </w:r>
-    </w:p>
-    <w:p>
-      <w:pPr>
-        <w:rPr>
-          <w:lang w:val="es-AR"/>
-        </w:rPr>
-      </w:pPr>
-      <w:r>
-        <w:rPr>
-          <w:lang w:val="es-AR"/>
-        </w:rPr>
-        <w:t>Recién ahora sí — verificar que el micrófono y el speaker están detectados:</w:t>
+        <w:t>arecord -l</w:t>
       </w:r>
     </w:p>
     <w:p>
@@ -3586,44 +3556,68 @@
           <w:sz w:val="20"/>
           <w:lang w:val="es-AR"/>
         </w:rPr>
-        <w:t>arecord -l</w:t>
+        <w:t>aplay -l</w:t>
+      </w:r>
+    </w:p>
+    <w:p>
+      <w:pPr>
+        <w:rPr>
+          <w:lang w:val="es-AR"/>
+        </w:rPr>
+      </w:pPr>
+      <w:r>
+        <w:rPr>
+          <w:lang w:val="es-AR"/>
+        </w:rPr>
+        <w:lastRenderedPageBreak/>
+        <w:t>Resu</w:t>
+      </w:r>
+      <w:r>
+        <w:rPr>
+          <w:lang w:val="es-AR"/>
+        </w:rPr>
+        <w:t>ltado esperado (ambos comandos deberían mostrar la misma card):</w:t>
       </w:r>
     </w:p>
     <w:p>
       <w:pPr>
         <w:ind w:left="283"/>
-        <w:rPr>
-          <w:lang w:val="es-AR"/>
-        </w:rPr>
       </w:pPr>
       <w:r>
         <w:rPr>
           <w:rFonts w:ascii="Consolas" w:hAnsi="Consolas"/>
           <w:color w:val="141414"/>
           <w:sz w:val="20"/>
-          <w:lang w:val="es-AR"/>
-        </w:rPr>
-        <w:t>aplay -l</w:t>
-      </w:r>
-    </w:p>
-    <w:p>
-      <w:pPr>
-        <w:rPr>
-          <w:lang w:val="es-AR"/>
-        </w:rPr>
-      </w:pPr>
-      <w:r>
-        <w:rPr>
-          <w:lang w:val="es-AR"/>
-        </w:rPr>
-        <w:lastRenderedPageBreak/>
-        <w:t>Resu</w:t>
-      </w:r>
-      <w:r>
-        <w:rPr>
-          <w:lang w:val="es-AR"/>
-        </w:rPr>
-        <w:t>ltado esperado (ambos comandos deberían mostrar la misma card):</w:t>
+        </w:rPr>
+        <w:t>card 0: sndrpigooglevoi [snd_rpi_googlevoicehat_soundcar]</w:t>
+      </w:r>
+    </w:p>
+    <w:p>
+      <w:pPr>
+        <w:pStyle w:val="Ttulo2"/>
+        <w:rPr>
+          <w:lang w:val="es-AR"/>
+        </w:rPr>
+      </w:pPr>
+      <w:r>
+        <w:rPr>
+          <w:color w:val="2C5A8F"/>
+          <w:lang w:val="es-AR"/>
+        </w:rPr>
+        <w:t>Test del micrófono</w:t>
+      </w:r>
+    </w:p>
+    <w:p>
+      <w:pPr>
+        <w:rPr>
+          <w:lang w:val="es-AR"/>
+        </w:rPr>
+      </w:pPr>
+      <w:r>
+        <w:rPr>
+          <w:lang w:val="es-AR"/>
+        </w:rPr>
+        <w:t>Grabar 5-10 segundos (Ctrl+C para cortar):</w:t>
       </w:r>
     </w:p>
     <w:p>
@@ -3636,7 +3630,7 @@
           <w:color w:val="141414"/>
           <w:sz w:val="20"/>
         </w:rPr>
-        <w:t>card 0: sndrpigooglevoi [snd_rpi_googlevoicehat_soundcar]</w:t>
+        <w:t>arecord -D plughw:0,0 -f cd test.wav</w:t>
       </w:r>
     </w:p>
     <w:p>
@@ -3651,97 +3645,84 @@
           <w:color w:val="2C5A8F"/>
           <w:lang w:val="es-AR"/>
         </w:rPr>
-        <w:t>Test del micrófono</w:t>
-      </w:r>
-    </w:p>
-    <w:p>
-      <w:pPr>
-        <w:rPr>
-          <w:lang w:val="es-AR"/>
-        </w:rPr>
-      </w:pPr>
-      <w:r>
-        <w:rPr>
-          <w:lang w:val="es-AR"/>
-        </w:rPr>
-        <w:t>Grabar 5-10 segundos (Ctrl+C para cortar):</w:t>
+        <w:t>Test del speaker</w:t>
+      </w:r>
+    </w:p>
+    <w:p>
+      <w:pPr>
+        <w:rPr>
+          <w:lang w:val="es-AR"/>
+        </w:rPr>
+      </w:pPr>
+      <w:r>
+        <w:rPr>
+          <w:lang w:val="es-AR"/>
+        </w:rPr>
+        <w:t>Reproducir en la R</w:t>
+      </w:r>
+      <w:r>
+        <w:rPr>
+          <w:lang w:val="es-AR"/>
+        </w:rPr>
+        <w:t>aspberry lo que acabás de grabar:</w:t>
       </w:r>
     </w:p>
     <w:p>
       <w:pPr>
         <w:ind w:left="283"/>
+        <w:rPr>
+          <w:lang w:val="es-AR"/>
+        </w:rPr>
       </w:pPr>
       <w:r>
         <w:rPr>
           <w:rFonts w:ascii="Consolas" w:hAnsi="Consolas"/>
           <w:color w:val="141414"/>
           <w:sz w:val="20"/>
-        </w:rPr>
-        <w:t>arecord -D plughw:0,0 -f cd test.wav</w:t>
-      </w:r>
-    </w:p>
-    <w:p>
-      <w:pPr>
-        <w:pStyle w:val="Ttulo2"/>
-        <w:rPr>
-          <w:lang w:val="es-AR"/>
-        </w:rPr>
-      </w:pPr>
-      <w:r>
-        <w:rPr>
-          <w:color w:val="2C5A8F"/>
-          <w:lang w:val="es-AR"/>
-        </w:rPr>
-        <w:t>Test del speaker</w:t>
-      </w:r>
-    </w:p>
-    <w:p>
-      <w:pPr>
-        <w:rPr>
-          <w:lang w:val="es-AR"/>
-        </w:rPr>
-      </w:pPr>
-      <w:r>
-        <w:rPr>
-          <w:lang w:val="es-AR"/>
-        </w:rPr>
-        <w:t>Reproducir en la R</w:t>
-      </w:r>
-      <w:r>
-        <w:rPr>
-          <w:lang w:val="es-AR"/>
-        </w:rPr>
-        <w:t>aspberry lo que acabás de grabar:</w:t>
+          <w:lang w:val="es-AR"/>
+        </w:rPr>
+        <w:t>aplay -D plughw:0,0 test.wav</w:t>
+      </w:r>
+    </w:p>
+    <w:p>
+      <w:pPr>
+        <w:rPr>
+          <w:lang w:val="es-AR"/>
+        </w:rPr>
+      </w:pPr>
+      <w:r>
+        <w:rPr>
+          <w:lang w:val="es-AR"/>
+        </w:rPr>
+        <w:t>O generar un tono de prueba:</w:t>
       </w:r>
     </w:p>
     <w:p>
       <w:pPr>
         <w:ind w:left="283"/>
-        <w:rPr>
-          <w:lang w:val="es-AR"/>
-        </w:rPr>
       </w:pPr>
       <w:r>
         <w:rPr>
           <w:rFonts w:ascii="Consolas" w:hAnsi="Consolas"/>
           <w:color w:val="141414"/>
           <w:sz w:val="20"/>
-          <w:lang w:val="es-AR"/>
-        </w:rPr>
-        <w:t>aplay -D plughw:0,0 test.wav</w:t>
-      </w:r>
-    </w:p>
-    <w:p>
-      <w:pPr>
-        <w:rPr>
-          <w:lang w:val="es-AR"/>
-        </w:rPr>
-      </w:pPr>
-      <w:r>
-        <w:rPr>
-          <w:lang w:val="es-AR"/>
-        </w:rPr>
-        <w:t>O generar un tono de prueba:</w:t>
+        </w:rPr>
+        <w:t>speaker-test -D plughw:0,0 -c 2 -t sine -f 440</w:t>
+      </w:r>
+    </w:p>
+    <w:p>
+      <w:pPr>
+        <w:pStyle w:val="Ttulo2"/>
+        <w:rPr>
+          <w:lang w:val="es-AR"/>
+        </w:rPr>
+      </w:pPr>
+      <w:r>
+        <w:rPr>
+          <w:color w:val="2C5A8F"/>
+          <w:lang w:val="es-AR"/>
+        </w:rPr>
+        <w:t>Copiar el audio grabado a tu PC (opcional)</w:t>
       </w:r>
     </w:p>
     <w:p>
@@ -3754,101 +3735,86 @@
           <w:color w:val="141414"/>
           <w:sz w:val="20"/>
         </w:rPr>
-        <w:t>speaker-test -D plughw:0,0 -c 2 -t sine -f 440</w:t>
-      </w:r>
-    </w:p>
-    <w:p>
-      <w:pPr>
-        <w:pStyle w:val="Ttulo2"/>
-        <w:rPr>
-          <w:lang w:val="es-AR"/>
-        </w:rPr>
-      </w:pPr>
-      <w:r>
-        <w:rPr>
-          <w:color w:val="2C5A8F"/>
-          <w:lang w:val="es-AR"/>
-        </w:rPr>
-        <w:t>Copiar el audio grabado a tu PC (opcional)</w:t>
-      </w:r>
-    </w:p>
-    <w:p>
-      <w:pPr>
-        <w:ind w:left="283"/>
-      </w:pPr>
+        <w:t xml:space="preserve">scp </w:t>
+      </w:r>
       <w:r>
         <w:rPr>
           <w:rFonts w:ascii="Consolas" w:hAnsi="Consolas"/>
           <w:color w:val="141414"/>
           <w:sz w:val="20"/>
         </w:rPr>
-        <w:t xml:space="preserve">scp </w:t>
-      </w:r>
+        <w:t>brumelab@brumexa.local:~/proyectos/brumexa-edge/test.wav .</w:t>
+      </w:r>
+    </w:p>
+    <w:p>
+      <w:pPr>
+        <w:pStyle w:val="Ttulo1"/>
+        <w:rPr>
+          <w:lang w:val="es-AR"/>
+        </w:rPr>
+      </w:pPr>
+      <w:r>
+        <w:rPr>
+          <w:color w:val="1F3A5F"/>
+          <w:lang w:val="es-AR"/>
+        </w:rPr>
+        <w:t>13. Arranque del servidor</w:t>
+      </w:r>
+    </w:p>
+    <w:p>
+      <w:pPr>
+        <w:rPr>
+          <w:lang w:val="es-AR"/>
+        </w:rPr>
+      </w:pPr>
+      <w:r>
+        <w:rPr>
+          <w:lang w:val="es-AR"/>
+        </w:rPr>
+        <w:t>Desde ~/proyectos/brumexa-edge:</w:t>
+      </w:r>
+    </w:p>
+    <w:p>
+      <w:pPr>
+        <w:ind w:left="283"/>
+        <w:rPr>
+          <w:lang w:val="es-AR"/>
+        </w:rPr>
+      </w:pPr>
       <w:r>
         <w:rPr>
           <w:rFonts w:ascii="Consolas" w:hAnsi="Consolas"/>
           <w:color w:val="141414"/>
           <w:sz w:val="20"/>
-        </w:rPr>
-        <w:t>brumelab@brumexa.local:~/proyectos/brumexa-edge/test.wav .</w:t>
-      </w:r>
-    </w:p>
-    <w:p>
-      <w:pPr>
-        <w:pStyle w:val="Ttulo1"/>
-        <w:rPr>
-          <w:lang w:val="es-AR"/>
-        </w:rPr>
-      </w:pPr>
-      <w:r>
-        <w:rPr>
-          <w:color w:val="1F3A5F"/>
-          <w:lang w:val="es-AR"/>
-        </w:rPr>
-        <w:t>13. Arranque del servidor</w:t>
-      </w:r>
-    </w:p>
-    <w:p>
-      <w:pPr>
-        <w:rPr>
-          <w:lang w:val="es-AR"/>
-        </w:rPr>
-      </w:pPr>
-      <w:r>
-        <w:rPr>
-          <w:lang w:val="es-AR"/>
-        </w:rPr>
-        <w:t>Desde ~/proyectos/brumexa-edge:</w:t>
+          <w:lang w:val="es-AR"/>
+        </w:rPr>
+        <w:t>node server.js</w:t>
+      </w:r>
+    </w:p>
+    <w:p>
+      <w:pPr>
+        <w:rPr>
+          <w:lang w:val="es-AR"/>
+        </w:rPr>
+      </w:pPr>
+      <w:r>
+        <w:rPr>
+          <w:lang w:val="es-AR"/>
+        </w:rPr>
+        <w:t>En el log debería aparecer:</w:t>
       </w:r>
     </w:p>
     <w:p>
       <w:pPr>
         <w:ind w:left="283"/>
-        <w:rPr>
-          <w:lang w:val="es-AR"/>
-        </w:rPr>
       </w:pPr>
       <w:r>
         <w:rPr>
           <w:rFonts w:ascii="Consolas" w:hAnsi="Consolas"/>
           <w:color w:val="141414"/>
           <w:sz w:val="20"/>
-          <w:lang w:val="es-AR"/>
-        </w:rPr>
-        <w:t>node server.js</w:t>
-      </w:r>
-    </w:p>
-    <w:p>
-      <w:pPr>
-        <w:rPr>
-          <w:lang w:val="es-AR"/>
-        </w:rPr>
-      </w:pPr>
-      <w:r>
-        <w:rPr>
-          <w:lang w:val="es-AR"/>
-        </w:rPr>
-        <w:t>En el log debería aparecer:</w:t>
+        </w:rPr>
+        <w:t>[server] listening on port 3000</w:t>
       </w:r>
     </w:p>
     <w:p>
@@ -3861,39 +3827,43 @@
           <w:color w:val="141414"/>
           <w:sz w:val="20"/>
         </w:rPr>
-        <w:t>[server] listening on port 3000</w:t>
+        <w:t>[livekit] session módulo listo</w:t>
+      </w:r>
+    </w:p>
+    <w:p>
+      <w:pPr>
+        <w:rPr>
+          <w:lang w:val="es-AR"/>
+        </w:rPr>
+      </w:pPr>
+      <w:r>
+        <w:rPr>
+          <w:lang w:val="es-AR"/>
+        </w:rPr>
+        <w:t xml:space="preserve">Desde tu PC, abrir en el </w:t>
+      </w:r>
+      <w:r>
+        <w:rPr>
+          <w:lang w:val="es-AR"/>
+        </w:rPr>
+        <w:t>browser:</w:t>
       </w:r>
     </w:p>
     <w:p>
       <w:pPr>
         <w:ind w:left="283"/>
+        <w:rPr>
+          <w:lang w:val="es-AR"/>
+        </w:rPr>
       </w:pPr>
       <w:r>
         <w:rPr>
           <w:rFonts w:ascii="Consolas" w:hAnsi="Consolas"/>
           <w:color w:val="141414"/>
           <w:sz w:val="20"/>
-        </w:rPr>
-        <w:t>[livekit] session módulo listo</w:t>
-      </w:r>
-    </w:p>
-    <w:p>
-      <w:pPr>
-        <w:rPr>
-          <w:lang w:val="es-AR"/>
-        </w:rPr>
-      </w:pPr>
-      <w:r>
-        <w:rPr>
-          <w:lang w:val="es-AR"/>
-        </w:rPr>
-        <w:t xml:space="preserve">Desde tu PC, abrir en el </w:t>
-      </w:r>
-      <w:r>
-        <w:rPr>
-          <w:lang w:val="es-AR"/>
-        </w:rPr>
-        <w:t>browser:</w:t>
+          <w:lang w:val="es-AR"/>
+        </w:rPr>
+        <w:t>http://brumexa.local:3000</w:t>
       </w:r>
     </w:p>
     <w:p>
@@ -3910,7 +3880,7 @@
           <w:sz w:val="20"/>
           <w:lang w:val="es-AR"/>
         </w:rPr>
-        <w:t>http://brumexa.local:3000</w:t>
+        <w:t>o  http://192.168.X.X:3000  (con la IP directa)</w:t>
       </w:r>
     </w:p>
     <w:p>
@@ -3927,39 +3897,35 @@
           <w:sz w:val="20"/>
           <w:lang w:val="es-AR"/>
         </w:rPr>
-        <w:t>o  http://192.168.X.X:3000  (con la IP directa)</w:t>
+        <w:t>o  http://localhost:3000  (si usás SSH port forwarding — ver sección 3)</w:t>
+      </w:r>
+    </w:p>
+    <w:p>
+      <w:pPr>
+        <w:pStyle w:val="Ttulo2"/>
+        <w:rPr>
+          <w:lang w:val="es-AR"/>
+        </w:rPr>
+      </w:pPr>
+      <w:r>
+        <w:rPr>
+          <w:color w:val="2C5A8F"/>
+          <w:lang w:val="es-AR"/>
+        </w:rPr>
+        <w:t>Arranque automático al boot (opcional)</w:t>
       </w:r>
     </w:p>
     <w:p>
       <w:pPr>
         <w:ind w:left="283"/>
-        <w:rPr>
-          <w:lang w:val="es-AR"/>
-        </w:rPr>
       </w:pPr>
       <w:r>
         <w:rPr>
           <w:rFonts w:ascii="Consolas" w:hAnsi="Consolas"/>
           <w:color w:val="141414"/>
           <w:sz w:val="20"/>
-          <w:lang w:val="es-AR"/>
-        </w:rPr>
-        <w:t>o  http://localhost:3000  (si usás SSH port forwarding — ver sección 3)</w:t>
-      </w:r>
-    </w:p>
-    <w:p>
-      <w:pPr>
-        <w:pStyle w:val="Ttulo2"/>
-        <w:rPr>
-          <w:lang w:val="es-AR"/>
-        </w:rPr>
-      </w:pPr>
-      <w:r>
-        <w:rPr>
-          <w:color w:val="2C5A8F"/>
-          <w:lang w:val="es-AR"/>
-        </w:rPr>
-        <w:t>Arranque automático al boot (opcional)</w:t>
+        </w:rPr>
+        <w:t>sudo npm install -g pm2</w:t>
       </w:r>
     </w:p>
     <w:p>
@@ -3972,28 +3938,28 @@
           <w:color w:val="141414"/>
           <w:sz w:val="20"/>
         </w:rPr>
-        <w:t>sudo npm install -g pm2</w:t>
-      </w:r>
-    </w:p>
-    <w:p>
-      <w:pPr>
-        <w:ind w:left="283"/>
-      </w:pPr>
+        <w:t>pm2 start server.js --name brumexa-edg</w:t>
+      </w:r>
       <w:r>
         <w:rPr>
           <w:rFonts w:ascii="Consolas" w:hAnsi="Consolas"/>
           <w:color w:val="141414"/>
           <w:sz w:val="20"/>
         </w:rPr>
-        <w:t>pm2 start server.js --name brumexa-edg</w:t>
-      </w:r>
+        <w:t>e</w:t>
+      </w:r>
+    </w:p>
+    <w:p>
+      <w:pPr>
+        <w:ind w:left="283"/>
+      </w:pPr>
       <w:r>
         <w:rPr>
           <w:rFonts w:ascii="Consolas" w:hAnsi="Consolas"/>
           <w:color w:val="141414"/>
           <w:sz w:val="20"/>
         </w:rPr>
-        <w:t>e</w:t>
+        <w:t>pm2 startup</w:t>
       </w:r>
     </w:p>
     <w:p>
@@ -4006,7 +3972,108 @@
           <w:color w:val="141414"/>
           <w:sz w:val="20"/>
         </w:rPr>
-        <w:t>pm2 startup</w:t>
+        <w:t>pm2 save</w:t>
+      </w:r>
+    </w:p>
+    <w:p>
+      <w:pPr>
+        <w:pStyle w:val="Ttulo1"/>
+      </w:pPr>
+      <w:r>
+        <w:rPr>
+          <w:color w:val="1F3A5F"/>
+        </w:rPr>
+        <w:lastRenderedPageBreak/>
+        <w:t>14. Problemas comunes</w:t>
+      </w:r>
+    </w:p>
+    <w:p>
+      <w:pPr>
+        <w:pStyle w:val="Ttulo2"/>
+      </w:pPr>
+      <w:r>
+        <w:rPr>
+          <w:color w:val="2C5A8F"/>
+        </w:rPr>
+        <w:t>SSH: "Could not resolve hostname brumexa.local"</w:t>
+      </w:r>
+    </w:p>
+    <w:p>
+      <w:pPr>
+        <w:rPr>
+          <w:lang w:val="es-AR"/>
+        </w:rPr>
+      </w:pPr>
+      <w:r>
+        <w:rPr>
+          <w:lang w:val="es-AR"/>
+        </w:rPr>
+        <w:t>mDNS no levantó. Usar IP directa desde el router.</w:t>
+      </w:r>
+    </w:p>
+    <w:p>
+      <w:pPr>
+        <w:pStyle w:val="Ttulo2"/>
+        <w:rPr>
+          <w:lang w:val="es-AR"/>
+        </w:rPr>
+      </w:pPr>
+      <w:r>
+        <w:rPr>
+          <w:color w:val="2C5A8F"/>
+          <w:lang w:val="es-AR"/>
+        </w:rPr>
+        <w:t>arecord -l / aplay -l no muestran la card</w:t>
+      </w:r>
+    </w:p>
+    <w:p>
+      <w:pPr>
+        <w:pStyle w:val="Listaconvietas"/>
+      </w:pPr>
+      <w:r>
+        <w:t>Revisar /boot/firmware/config.txt (las 2 líneas dtparam/dtoverlay)</w:t>
+      </w:r>
+    </w:p>
+    <w:p>
+      <w:pPr>
+        <w:pStyle w:val="Listaconvietas"/>
+      </w:pPr>
+      <w:r>
+        <w:t>Revi</w:t>
+      </w:r>
+      <w:r>
+        <w:t>sar cables (SCK/BCLK, WS/LRC, SD, DIN)</w:t>
+      </w:r>
+    </w:p>
+    <w:p>
+      <w:pPr>
+        <w:pStyle w:val="Ttulo2"/>
+        <w:rPr>
+          <w:lang w:val="es-AR"/>
+        </w:rPr>
+      </w:pPr>
+      <w:r>
+        <w:rPr>
+          <w:color w:val="2C5A8F"/>
+          <w:lang w:val="es-AR"/>
+        </w:rPr>
+        <w:t>Audio vacío o con silencio (mic)</w:t>
+      </w:r>
+    </w:p>
+    <w:p>
+      <w:pPr>
+        <w:pStyle w:val="Listaconvietas"/>
+      </w:pPr>
+      <w:r>
+        <w:t>Usar mono (-c 1) y 16000 Hz</w:t>
+      </w:r>
+    </w:p>
+    <w:p>
+      <w:pPr>
+        <w:pStyle w:val="Listaconvietas"/>
+      </w:pPr>
+      <w:r>
+        <w:t>Probar:</w:t>
       </w:r>
     </w:p>
     <w:p>
@@ -4019,19 +4086,7 @@
           <w:color w:val="141414"/>
           <w:sz w:val="20"/>
         </w:rPr>
-        <w:t>pm2 save</w:t>
-      </w:r>
-    </w:p>
-    <w:p>
-      <w:pPr>
-        <w:pStyle w:val="Ttulo1"/>
-      </w:pPr>
-      <w:r>
-        <w:rPr>
-          <w:color w:val="1F3A5F"/>
-        </w:rPr>
-        <w:lastRenderedPageBreak/>
-        <w:t>14. Problemas comunes</w:t>
+        <w:t>arecord -D plughw:0,0 -f S16_LE -r 16000 -c 1 test.wav</w:t>
       </w:r>
     </w:p>
     <w:p>
@@ -4042,43 +4097,80 @@
         <w:rPr>
           <w:color w:val="2C5A8F"/>
         </w:rPr>
-        <w:t>SSH: "Could not resolve hostname brumexa.local"</w:t>
-      </w:r>
-    </w:p>
-    <w:p>
-      <w:pPr>
-        <w:rPr>
-          <w:lang w:val="es-AR"/>
-        </w:rPr>
-      </w:pPr>
-      <w:r>
-        <w:rPr>
-          <w:lang w:val="es-AR"/>
-        </w:rPr>
-        <w:t>mDNS no levantó. Usar IP directa desde el router.</w:t>
+        <w:t>Speaker no suena</w:t>
+      </w:r>
+    </w:p>
+    <w:p>
+      <w:pPr>
+        <w:pStyle w:val="Listaconvietas"/>
+        <w:rPr>
+          <w:lang w:val="es-AR"/>
+        </w:rPr>
+      </w:pPr>
+      <w:r>
+        <w:rPr>
+          <w:lang w:val="es-AR"/>
+        </w:rPr>
+        <w:t>Verificar que el parlante está cone</w:t>
+      </w:r>
+      <w:r>
+        <w:rPr>
+          <w:lang w:val="es-AR"/>
+        </w:rPr>
+        <w:t>ctado a los pines de salida del MAX98357A</w:t>
+      </w:r>
+    </w:p>
+    <w:p>
+      <w:pPr>
+        <w:pStyle w:val="Listaconvietas"/>
+        <w:rPr>
+          <w:lang w:val="es-AR"/>
+        </w:rPr>
+      </w:pPr>
+      <w:r>
+        <w:rPr>
+          <w:lang w:val="es-AR"/>
+        </w:rPr>
+        <w:t>Verificar alimentación (VIN = 5V, no 3.3V)</w:t>
+      </w:r>
+    </w:p>
+    <w:p>
+      <w:pPr>
+        <w:pStyle w:val="Listaconvietas"/>
+        <w:rPr>
+          <w:lang w:val="es-AR"/>
+        </w:rPr>
+      </w:pPr>
+      <w:r>
+        <w:rPr>
+          <w:lang w:val="es-AR"/>
+        </w:rPr>
+        <w:t>Probar con speaker-test para descartar problema de archivo</w:t>
       </w:r>
     </w:p>
     <w:p>
       <w:pPr>
         <w:pStyle w:val="Ttulo2"/>
-        <w:rPr>
-          <w:lang w:val="es-AR"/>
-        </w:rPr>
       </w:pPr>
       <w:r>
         <w:rPr>
           <w:color w:val="2C5A8F"/>
-          <w:lang w:val="es-AR"/>
-        </w:rPr>
-        <w:t>arecord -l / aplay -l no muestran la card</w:t>
+        </w:rPr>
+        <w:t>Ruido / interferencia</w:t>
       </w:r>
     </w:p>
     <w:p>
       <w:pPr>
         <w:pStyle w:val="Listaconvietas"/>
-      </w:pPr>
-      <w:r>
-        <w:t>Revisar /boot/firmware/config.txt (las 2 líneas dtparam/dtoverlay)</w:t>
+        <w:rPr>
+          <w:lang w:val="es-AR"/>
+        </w:rPr>
+      </w:pPr>
+      <w:r>
+        <w:rPr>
+          <w:lang w:val="es-AR"/>
+        </w:rPr>
+        <w:t>Revisar conexión de GND (común entre mic, speaker y Pi)</w:t>
       </w:r>
     </w:p>
     <w:p>
@@ -4086,10 +4178,7 @@
         <w:pStyle w:val="Listaconvietas"/>
       </w:pPr>
       <w:r>
-        <w:t>Revi</w:t>
-      </w:r>
-      <w:r>
-        <w:t>sar cables (SCK/BCLK, WS/LRC, SD, DIN)</w:t>
+        <w:t>Usar cables más cortos</w:t>
       </w:r>
     </w:p>
     <w:p>
@@ -4103,30 +4192,38 @@
         <w:rPr>
           <w:lang w:val="es-AR"/>
         </w:rPr>
-        <w:t>sudo reboot después de editar config.txt</w:t>
+        <w:t>Separar fís</w:t>
+      </w:r>
+      <w:r>
+        <w:rPr>
+          <w:lang w:val="es-AR"/>
+        </w:rPr>
+        <w:t>icamente el cable del mic del cable del parlante</w:t>
       </w:r>
     </w:p>
     <w:p>
       <w:pPr>
         <w:pStyle w:val="Ttulo2"/>
-        <w:rPr>
-          <w:lang w:val="es-AR"/>
-        </w:rPr>
       </w:pPr>
       <w:r>
         <w:rPr>
           <w:color w:val="2C5A8F"/>
-          <w:lang w:val="es-AR"/>
-        </w:rPr>
-        <w:t>Audio vacío o con silencio (mic)</w:t>
+        </w:rPr>
+        <w:t>"Cannot find native binding" al correr server.js</w:t>
       </w:r>
     </w:p>
     <w:p>
       <w:pPr>
         <w:pStyle w:val="Listaconvietas"/>
-      </w:pPr>
-      <w:r>
-        <w:t>Usar mono (-c 1) y 16000 Hz</w:t>
+        <w:rPr>
+          <w:lang w:val="es-AR"/>
+        </w:rPr>
+      </w:pPr>
+      <w:r>
+        <w:rPr>
+          <w:lang w:val="es-AR"/>
+        </w:rPr>
+        <w:t>El OS es 32-bit. Reflashear con Raspberry Pi OS Lite 64-bit.</w:t>
       </w:r>
     </w:p>
     <w:p>
@@ -4134,214 +4231,69 @@
         <w:pStyle w:val="Listaconvietas"/>
       </w:pPr>
       <w:r>
-        <w:t>Probar:</w:t>
+        <w:t>Verificar con:</w:t>
       </w:r>
     </w:p>
     <w:p>
       <w:pPr>
         <w:ind w:left="283"/>
+        <w:rPr>
+          <w:lang w:val="es-AR"/>
+        </w:rPr>
       </w:pPr>
       <w:r>
         <w:rPr>
           <w:rFonts w:ascii="Consolas" w:hAnsi="Consolas"/>
           <w:color w:val="141414"/>
           <w:sz w:val="20"/>
-        </w:rPr>
-        <w:t>arecord -D plughw:0,0 -f S16_LE -r 16000 -c 1 test.wav</w:t>
+          <w:lang w:val="es-AR"/>
+        </w:rPr>
+        <w:t>uname -m     # debe decir "aarch64"</w:t>
       </w:r>
     </w:p>
     <w:p>
       <w:pPr>
         <w:pStyle w:val="Ttulo2"/>
+        <w:rPr>
+          <w:lang w:val="es-AR"/>
+        </w:rPr>
       </w:pPr>
       <w:r>
         <w:rPr>
           <w:color w:val="2C5A8F"/>
-        </w:rPr>
-        <w:t>Speaker no suena</w:t>
-      </w:r>
-    </w:p>
-    <w:p>
-      <w:pPr>
-        <w:pStyle w:val="Listaconvietas"/>
-        <w:rPr>
-          <w:lang w:val="es-AR"/>
-        </w:rPr>
-      </w:pPr>
-      <w:r>
-        <w:rPr>
-          <w:lang w:val="es-AR"/>
-        </w:rPr>
-        <w:t>Verificar que el parlante está cone</w:t>
-      </w:r>
-      <w:r>
-        <w:rPr>
-          <w:lang w:val="es-AR"/>
-        </w:rPr>
-        <w:t>ctado a los pines de salida del MAX98357A</w:t>
-      </w:r>
-    </w:p>
-    <w:p>
-      <w:pPr>
-        <w:pStyle w:val="Listaconvietas"/>
-        <w:rPr>
-          <w:lang w:val="es-AR"/>
-        </w:rPr>
-      </w:pPr>
-      <w:r>
-        <w:rPr>
-          <w:lang w:val="es-AR"/>
-        </w:rPr>
-        <w:t>Verificar alimentación (VIN = 5V, no 3.3V)</w:t>
-      </w:r>
-    </w:p>
-    <w:p>
-      <w:pPr>
-        <w:pStyle w:val="Listaconvietas"/>
-        <w:rPr>
-          <w:lang w:val="es-AR"/>
-        </w:rPr>
-      </w:pPr>
-      <w:r>
-        <w:rPr>
-          <w:lang w:val="es-AR"/>
-        </w:rPr>
-        <w:t>Probar con speaker-test para descartar problema de archivo</w:t>
-      </w:r>
-    </w:p>
-    <w:p>
-      <w:pPr>
-        <w:pStyle w:val="Ttulo2"/>
-      </w:pPr>
-      <w:r>
-        <w:rPr>
-          <w:color w:val="2C5A8F"/>
-        </w:rPr>
-        <w:t>Ruido / interferencia</w:t>
-      </w:r>
-    </w:p>
-    <w:p>
-      <w:pPr>
-        <w:pStyle w:val="Listaconvietas"/>
-        <w:rPr>
-          <w:lang w:val="es-AR"/>
-        </w:rPr>
-      </w:pPr>
-      <w:r>
-        <w:rPr>
-          <w:lang w:val="es-AR"/>
-        </w:rPr>
-        <w:t>Revisar conexión de GND (común entre mic, speaker y Pi)</w:t>
-      </w:r>
-    </w:p>
-    <w:p>
-      <w:pPr>
-        <w:pStyle w:val="Listaconvietas"/>
-      </w:pPr>
-      <w:r>
-        <w:t>Usar cables más cortos</w:t>
-      </w:r>
-    </w:p>
-    <w:p>
-      <w:pPr>
-        <w:pStyle w:val="Listaconvietas"/>
-        <w:rPr>
-          <w:lang w:val="es-AR"/>
-        </w:rPr>
-      </w:pPr>
-      <w:r>
-        <w:rPr>
-          <w:lang w:val="es-AR"/>
-        </w:rPr>
-        <w:t>Separar fís</w:t>
-      </w:r>
-      <w:r>
-        <w:rPr>
-          <w:lang w:val="es-AR"/>
-        </w:rPr>
-        <w:t>icamente el cable del mic del cable del parlante</w:t>
-      </w:r>
-    </w:p>
-    <w:p>
-      <w:pPr>
-        <w:pStyle w:val="Ttulo2"/>
-      </w:pPr>
-      <w:r>
-        <w:rPr>
-          <w:color w:val="2C5A8F"/>
-        </w:rPr>
-        <w:t>"Cannot find native binding" al correr server.js</w:t>
-      </w:r>
-    </w:p>
-    <w:p>
-      <w:pPr>
-        <w:pStyle w:val="Listaconvietas"/>
-        <w:rPr>
-          <w:lang w:val="es-AR"/>
-        </w:rPr>
-      </w:pPr>
-      <w:r>
-        <w:rPr>
-          <w:lang w:val="es-AR"/>
-        </w:rPr>
-        <w:t>El OS es 32-bit. Reflashear con Raspberry Pi OS Lite 64-bit.</w:t>
-      </w:r>
-    </w:p>
-    <w:p>
-      <w:pPr>
-        <w:pStyle w:val="Listaconvietas"/>
-      </w:pPr>
-      <w:r>
-        <w:t>Verificar con:</w:t>
+          <w:lang w:val="es-AR"/>
+        </w:rPr>
+        <w:t>npm install falla por memoria</w:t>
+      </w:r>
+    </w:p>
+    <w:p>
+      <w:r>
+        <w:rPr>
+          <w:lang w:val="es-AR"/>
+        </w:rPr>
+        <w:t xml:space="preserve">La Pi Zero 2W </w:t>
+      </w:r>
+      <w:r>
+        <w:rPr>
+          <w:lang w:val="es-AR"/>
+        </w:rPr>
+        <w:t xml:space="preserve">tiene 512MB. </w:t>
+      </w:r>
+      <w:r>
+        <w:t>Agregar swap:</w:t>
       </w:r>
     </w:p>
     <w:p>
       <w:pPr>
         <w:ind w:left="283"/>
-        <w:rPr>
-          <w:lang w:val="es-AR"/>
-        </w:rPr>
       </w:pPr>
       <w:r>
         <w:rPr>
           <w:rFonts w:ascii="Consolas" w:hAnsi="Consolas"/>
           <w:color w:val="141414"/>
           <w:sz w:val="20"/>
-          <w:lang w:val="es-AR"/>
-        </w:rPr>
-        <w:t>uname -m     # debe decir "aarch64"</w:t>
-      </w:r>
-    </w:p>
-    <w:p>
-      <w:pPr>
-        <w:pStyle w:val="Ttulo2"/>
-        <w:rPr>
-          <w:lang w:val="es-AR"/>
-        </w:rPr>
-      </w:pPr>
-      <w:r>
-        <w:rPr>
-          <w:color w:val="2C5A8F"/>
-          <w:lang w:val="es-AR"/>
-        </w:rPr>
-        <w:t>npm install falla por memoria</w:t>
-      </w:r>
-    </w:p>
-    <w:p>
-      <w:r>
-        <w:rPr>
-          <w:lang w:val="es-AR"/>
-        </w:rPr>
-        <w:t xml:space="preserve">La Pi Zero 2W </w:t>
-      </w:r>
-      <w:r>
-        <w:rPr>
-          <w:lang w:val="es-AR"/>
-        </w:rPr>
-        <w:t xml:space="preserve">tiene 512MB. </w:t>
-      </w:r>
-      <w:r>
-        <w:t>Agregar swap:</w:t>
+        </w:rPr>
+        <w:t>sudo dphys-swapfile swapoff</w:t>
       </w:r>
     </w:p>
     <w:p>
@@ -4354,7 +4306,7 @@
           <w:color w:val="141414"/>
           <w:sz w:val="20"/>
         </w:rPr>
-        <w:t>sudo dphys-swapfile swapoff</w:t>
+        <w:t>sudo nano /etc/dphys-swapfile    # CONF_SWAPSIZE=1024</w:t>
       </w:r>
     </w:p>
     <w:p>
@@ -4367,7 +4319,7 @@
           <w:color w:val="141414"/>
           <w:sz w:val="20"/>
         </w:rPr>
-        <w:t>sudo nano /etc/dphys-swapfile    # CONF_SWAPSIZE=1024</w:t>
+        <w:t>sudo dphys-swapfile setup</w:t>
       </w:r>
     </w:p>
     <w:p>
@@ -4380,7 +4332,38 @@
           <w:color w:val="141414"/>
           <w:sz w:val="20"/>
         </w:rPr>
-        <w:t>sudo dphys-swapfile setup</w:t>
+        <w:t>sudo dphys-swapfile swapon</w:t>
+      </w:r>
+    </w:p>
+    <w:p>
+      <w:pPr>
+        <w:pStyle w:val="Ttulo2"/>
+      </w:pPr>
+      <w:r>
+        <w:rPr>
+          <w:color w:val="2C5A8F"/>
+        </w:rPr>
+        <w:t>Port forwarding: "bind: Address already in use"</w:t>
+      </w:r>
+    </w:p>
+    <w:p>
+      <w:pPr>
+        <w:pStyle w:val="Listaconvietas"/>
+        <w:rPr>
+          <w:lang w:val="es-AR"/>
+        </w:rPr>
+      </w:pPr>
+      <w:r>
+        <w:rPr>
+          <w:lang w:val="es-AR"/>
+        </w:rPr>
+        <w:t xml:space="preserve">Ya hay algo escuchando en ese puerto </w:t>
+      </w:r>
+      <w:r>
+        <w:rPr>
+          <w:lang w:val="es-AR"/>
+        </w:rPr>
+        <w:t>local. Elegir otro o matar el proceso:</w:t>
       </w:r>
     </w:p>
     <w:p>
@@ -4393,38 +4376,7 @@
           <w:color w:val="141414"/>
           <w:sz w:val="20"/>
         </w:rPr>
-        <w:t>sudo dphys-swapfile swapon</w:t>
-      </w:r>
-    </w:p>
-    <w:p>
-      <w:pPr>
-        <w:pStyle w:val="Ttulo2"/>
-      </w:pPr>
-      <w:r>
-        <w:rPr>
-          <w:color w:val="2C5A8F"/>
-        </w:rPr>
-        <w:t>Port forwarding: "bind: Address already in use"</w:t>
-      </w:r>
-    </w:p>
-    <w:p>
-      <w:pPr>
-        <w:pStyle w:val="Listaconvietas"/>
-        <w:rPr>
-          <w:lang w:val="es-AR"/>
-        </w:rPr>
-      </w:pPr>
-      <w:r>
-        <w:rPr>
-          <w:lang w:val="es-AR"/>
-        </w:rPr>
-        <w:t xml:space="preserve">Ya hay algo escuchando en ese puerto </w:t>
-      </w:r>
-      <w:r>
-        <w:rPr>
-          <w:lang w:val="es-AR"/>
-        </w:rPr>
-        <w:t>local. Elegir otro o matar el proceso:</w:t>
+        <w:t>netstat -ano | findstr :3000   # Windows</w:t>
       </w:r>
     </w:p>
     <w:p>
@@ -4437,19 +4389,6 @@
           <w:color w:val="141414"/>
           <w:sz w:val="20"/>
         </w:rPr>
-        <w:t>netstat -ano | findstr :3000   # Windows</w:t>
-      </w:r>
-    </w:p>
-    <w:p>
-      <w:pPr>
-        <w:ind w:left="283"/>
-      </w:pPr>
-      <w:r>
-        <w:rPr>
-          <w:rFonts w:ascii="Consolas" w:hAnsi="Consolas"/>
-          <w:color w:val="141414"/>
-          <w:sz w:val="20"/>
-        </w:rPr>
         <w:lastRenderedPageBreak/>
         <w:t>taskkill /PID &lt;pid&gt;</w:t>
       </w:r>
@@ -4462,6 +4401,380 @@
     <w:p>
       <w:pPr>
         <w:pStyle w:val="Ttulo1"/>
+      </w:pPr>
+      <w:r>
+        <w:t xml:space="preserve">15. NeoPixel WS2812 (LEDs de estado)</w:t>
+      </w:r>
+    </w:p>
+    <w:p>
+      <w:pPr>
+        <w:pStyle w:val="Ttulo2"/>
+      </w:pPr>
+      <w:r>
+        <w:t xml:space="preserve">Hardware necesario</w:t>
+      </w:r>
+    </w:p>
+    <w:p>
+      <w:pPr>
+        <w:pStyle w:val="Listaconvietas"/>
+      </w:pPr>
+      <w:r>
+        <w:t xml:space="preserve">Placa NeoPixel de 8 LEDs RGB WS2812 5050</w:t>
+      </w:r>
+    </w:p>
+    <w:p>
+      <w:pPr>
+        <w:pStyle w:val="Listaconvietas"/>
+      </w:pPr>
+      <w:r>
+        <w:t xml:space="preserve">Cable Dupont hembra-hembra (3 cables: VCC, GND, DIN)</w:t>
+      </w:r>
+    </w:p>
+    <w:p>
+      <w:pPr>
+        <w:pStyle w:val="Listaconvietas"/>
+      </w:pPr>
+      <w:r>
+        <w:t xml:space="preserve">Resistor 300-500 Ohm (en serie en el cable DIN)</w:t>
+      </w:r>
+    </w:p>
+    <w:p>
+      <w:pPr>
+        <w:pStyle w:val="Listaconvietas"/>
+      </w:pPr>
+      <w:r>
+        <w:t xml:space="preserve">Capacitor electrolítico 470-1000 uF (entre VCC y GND de la tira)</w:t>
+      </w:r>
+    </w:p>
+    <w:p>
+      <w:pPr>
+        <w:pStyle w:val="Ttulo2"/>
+      </w:pPr>
+      <w:r>
+        <w:t xml:space="preserve">Pin recomendado: GPIO 10 (SPI MOSI)</w:t>
+      </w:r>
+    </w:p>
+    <w:p>
+      <w:pPr>
+        <w:jc w:val="center"/>
+        <w:rPr>
+          <w:lang w:val="es-AR"/>
+        </w:rPr>
+      </w:pPr>
+      <w:r>
+        <w:t xml:space="preserve">Se elige GPIO 10 (Physical Pin 19) en modo SPI para evitar conflictos:</w:t>
+      </w:r>
+    </w:p>
+    <w:p>
+      <w:pPr>
+        <w:pStyle w:val="Listaconvietas"/>
+      </w:pPr>
+      <w:r>
+        <w:t xml:space="preserve">GPIO 18 (PWM) → conflictua con el audio onboard del Pi (jack 3.5mm)</w:t>
+      </w:r>
+    </w:p>
+    <w:p>
+      <w:pPr>
+        <w:pStyle w:val="Listaconvietas"/>
+      </w:pPr>
+      <w:r>
+        <w:t xml:space="preserve">GPIO 21 (PCM) → conflictua con el micrófono I2S (INMP441)</w:t>
+      </w:r>
+    </w:p>
+    <w:p>
+      <w:pPr>
+        <w:pStyle w:val="Listaconvietas"/>
+      </w:pPr>
+      <w:r>
+        <w:t xml:space="preserve">GPIO 10 (SPI MOSI) → sin conflicto, SPI no se usa en el proyecto</w:t>
+      </w:r>
+    </w:p>
+    <w:p>
+      <w:pPr>
+        <w:pStyle w:val="Ttulo2"/>
+      </w:pPr>
+      <w:r>
+        <w:t xml:space="preserve">Cableado</w:t>
+      </w:r>
+    </w:p>
+    <w:p>
+      <w:pPr>
+        <w:jc w:val="center"/>
+        <w:rPr>
+          <w:lang w:val="es-AR"/>
+        </w:rPr>
+      </w:pPr>
+      <w:r>
+        <w:t xml:space="preserve">NeoPixel VCC  →  Pi Physical Pin 2 ó 4  (5V)</w:t>
+      </w:r>
+    </w:p>
+    <w:p>
+      <w:pPr>
+        <w:jc w:val="center"/>
+        <w:rPr>
+          <w:lang w:val="es-AR"/>
+        </w:rPr>
+      </w:pPr>
+      <w:r>
+        <w:t xml:space="preserve">NeoPixel GND  →  Pi Physical Pin 6  (GND)</w:t>
+      </w:r>
+    </w:p>
+    <w:p>
+      <w:pPr>
+        <w:jc w:val="center"/>
+        <w:rPr>
+          <w:lang w:val="es-AR"/>
+        </w:rPr>
+      </w:pPr>
+      <w:r>
+        <w:t xml:space="preserve">NeoPixel DIN  →  Pi Physical Pin 19 (GPIO 10)  [via resistor 300-500 Ohm]</w:t>
+      </w:r>
+    </w:p>
+    <w:p>
+      <w:pPr>
+        <w:jc w:val="center"/>
+        <w:rPr>
+          <w:lang w:val="es-AR"/>
+        </w:rPr>
+      </w:pPr>
+      <w:r>
+        <w:t xml:space="preserve">Tip: agregar capacitor 470-1000 uF entre VCC y GND del strip para evitar brownout en el Pi.</w:t>
+      </w:r>
+    </w:p>
+    <w:p>
+      <w:pPr>
+        <w:pStyle w:val="Ttulo2"/>
+      </w:pPr>
+      <w:r>
+        <w:t xml:space="preserve">Habilitar SPI en el Pi (una sola vez)</w:t>
+      </w:r>
+    </w:p>
+    <w:p>
+      <w:pPr>
+        <w:jc w:val="center"/>
+        <w:rPr>
+          <w:lang w:val="es-AR"/>
+        </w:rPr>
+      </w:pPr>
+      <w:r>
+        <w:t xml:space="preserve">sudo raspi-config</w:t>
+      </w:r>
+    </w:p>
+    <w:p>
+      <w:pPr>
+        <w:jc w:val="center"/>
+        <w:rPr>
+          <w:lang w:val="es-AR"/>
+        </w:rPr>
+      </w:pPr>
+      <w:r>
+        <w:t xml:space="preserve">  → Interface Options → SPI → Enable</w:t>
+      </w:r>
+    </w:p>
+    <w:p>
+      <w:pPr>
+        <w:jc w:val="center"/>
+        <w:rPr>
+          <w:lang w:val="es-AR"/>
+        </w:rPr>
+      </w:pPr>
+      <w:r>
+        <w:t xml:space="preserve">O directamente en /boot/firmware/config.txt:</w:t>
+      </w:r>
+    </w:p>
+    <w:p>
+      <w:pPr>
+        <w:jc w:val="center"/>
+        <w:rPr>
+          <w:lang w:val="es-AR"/>
+        </w:rPr>
+      </w:pPr>
+      <w:r>
+        <w:t xml:space="preserve">echo "dtparam=spi=on" | sudo tee -a /boot/firmware/config.txt</w:t>
+      </w:r>
+    </w:p>
+    <w:p>
+      <w:pPr>
+        <w:jc w:val="center"/>
+        <w:rPr>
+          <w:lang w:val="es-AR"/>
+        </w:rPr>
+      </w:pPr>
+      <w:r>
+        <w:t xml:space="preserve">sudo reboot</w:t>
+      </w:r>
+    </w:p>
+    <w:p>
+      <w:pPr>
+        <w:pStyle w:val="Ttulo2"/>
+      </w:pPr>
+      <w:r>
+        <w:t xml:space="preserve">Instalar librería Node.js (en la Pi)</w:t>
+      </w:r>
+    </w:p>
+    <w:p>
+      <w:pPr>
+        <w:jc w:val="center"/>
+        <w:rPr>
+          <w:lang w:val="es-AR"/>
+        </w:rPr>
+      </w:pPr>
+      <w:r>
+        <w:t xml:space="preserve">npm install rpi-ws281x-native</w:t>
+      </w:r>
+    </w:p>
+    <w:p>
+      <w:pPr>
+        <w:jc w:val="center"/>
+        <w:rPr>
+          <w:lang w:val="es-AR"/>
+        </w:rPr>
+      </w:pPr>
+      <w:r>
+        <w:t xml:space="preserve">Nota: requiere gcc para compilar el módulo nativo. En Windows de desarrollo se omite automáticamente sin romper el servidor.</w:t>
+      </w:r>
+    </w:p>
+    <w:p>
+      <w:pPr>
+        <w:pStyle w:val="Ttulo2"/>
+      </w:pPr>
+      <w:r>
+        <w:t xml:space="preserve">Funciones disponibles (lib/leds.js)</w:t>
+      </w:r>
+    </w:p>
+    <w:p>
+      <w:pPr>
+        <w:pStyle w:val="Listaconvietas"/>
+      </w:pPr>
+      <w:r>
+        <w:t xml:space="preserve">leds.init()             — inicializa el módulo y el pin GPIO. Llamar al arrancar el servidor.</w:t>
+      </w:r>
+    </w:p>
+    <w:p>
+      <w:pPr>
+        <w:pStyle w:val="Listaconvietas"/>
+      </w:pPr>
+      <w:r>
+        <w:t xml:space="preserve">leds.on({ r, g, b })    — enciende todos los LEDs con el color indicado (0-255 por canal).</w:t>
+      </w:r>
+    </w:p>
+    <w:p>
+      <w:pPr>
+        <w:pStyle w:val="Listaconvietas"/>
+      </w:pPr>
+      <w:r>
+        <w:t xml:space="preserve">leds.off()              — apaga todos los LEDs.</w:t>
+      </w:r>
+    </w:p>
+    <w:p>
+      <w:pPr>
+        <w:pStyle w:val="Listaconvietas"/>
+      </w:pPr>
+      <w:r>
+        <w:t xml:space="preserve">leds.cleanup()          — apaga y libera el hardware. Llamar al cerrar el proceso.</w:t>
+      </w:r>
+    </w:p>
+    <w:p>
+      <w:pPr>
+        <w:pStyle w:val="Ttulo2"/>
+      </w:pPr>
+      <w:r>
+        <w:t xml:space="preserve">Ejemplo de uso</w:t>
+      </w:r>
+    </w:p>
+    <w:p>
+      <w:pPr>
+        <w:jc w:val="center"/>
+        <w:rPr>
+          <w:lang w:val="es-AR"/>
+        </w:rPr>
+      </w:pPr>
+      <w:r>
+        <w:t xml:space="preserve">const leds = require('./lib/leds');</w:t>
+      </w:r>
+    </w:p>
+    <w:p>
+      <w:pPr>
+        <w:jc w:val="center"/>
+        <w:rPr>
+          <w:lang w:val="es-AR"/>
+        </w:rPr>
+      </w:pPr>
+      <w:r>
+        <w:t xml:space="preserve">leds.init();</w:t>
+      </w:r>
+    </w:p>
+    <w:p>
+      <w:pPr>
+        <w:jc w:val="center"/>
+        <w:rPr>
+          <w:lang w:val="es-AR"/>
+        </w:rPr>
+      </w:pPr>
+      <w:r>
+        <w:t xml:space="preserve">leds.on({ r: 0, g: 0, b: 60 });   // azul suave = servidor activo</w:t>
+      </w:r>
+    </w:p>
+    <w:p>
+      <w:pPr>
+        <w:jc w:val="center"/>
+        <w:rPr>
+          <w:lang w:val="es-AR"/>
+        </w:rPr>
+      </w:pPr>
+      <w:r>
+        <w:t xml:space="preserve">leds.on({ r: 60, g: 0, b: 0 });   // rojo = error</w:t>
+      </w:r>
+    </w:p>
+    <w:p>
+      <w:pPr>
+        <w:jc w:val="center"/>
+        <w:rPr>
+          <w:lang w:val="es-AR"/>
+        </w:rPr>
+      </w:pPr>
+      <w:r>
+        <w:t xml:space="preserve">leds.off();</w:t>
+      </w:r>
+    </w:p>
+    <w:p>
+      <w:pPr>
+        <w:jc w:val="center"/>
+        <w:rPr>
+          <w:lang w:val="es-AR"/>
+        </w:rPr>
+      </w:pPr>
+      <w:r>
+        <w:t xml:space="preserve">leds.cleanup();                    // al cerrar (SIGTERM/SIGINT)</w:t>
+      </w:r>
+    </w:p>
+    <w:p>
+      <w:pPr>
+        <w:pStyle w:val="Ttulo2"/>
+      </w:pPr>
+      <w:r>
+        <w:t xml:space="preserve">Comportamiento en Brumexa-Edge</w:t>
+      </w:r>
+    </w:p>
+    <w:p>
+      <w:pPr>
+        <w:pStyle w:val="Listaconvietas"/>
+      </w:pPr>
+      <w:r>
+        <w:t xml:space="preserve">Al arrancar el servidor → LEDs en azul suave (servidor activo)</w:t>
+      </w:r>
+    </w:p>
+    <w:p>
+      <w:pPr>
+        <w:pStyle w:val="Listaconvietas"/>
+      </w:pPr>
+      <w:r>
+        <w:t xml:space="preserve">Al cerrar el proceso (SIGTERM/SIGINT) → LEDs se apagan</w:t>
+      </w:r>
+    </w:p>
+    <w:p>
+      <w:pPr>
+        <w:pStyle w:val="Ttulo1"/>
         <w:rPr>
           <w:lang w:val="es-AR"/>
         </w:rPr>
@@ -4573,6 +4886,14 @@
       </w:pPr>
       <w:r>
         <w:t>Server corriendo en puerto 3000</w:t>
+      </w:r>
+    </w:p>
+    <w:p>
+      <w:pPr>
+        <w:pStyle w:val="Listaconvietas"/>
+      </w:pPr>
+      <w:r>
+        <w:t xml:space="preserve">NeoPixel WS2812 operativo (GPIO 10 SPI, azul al boot)</w:t>
       </w:r>
     </w:p>
     <w:p>

</xml_diff>

<commit_message>
feat: token estático desde .env (eliminar TOKEN_API_URL)
El programador entrega LIVEKIT_URL y LIVEKIT_TOKEN directamente.
Se elimina fetchTokenFromCentral() y la dependencia de TOKEN_API_URL.

Co-Authored-By: Claude Sonnet 4.6 <noreply@anthropic.com>
</commit_message>
<xml_diff>
--- a/Instructivo.docx
+++ b/Instructivo.docx
@@ -88,6 +88,14 @@
         <w:pStyle w:val="Listaconvietas"/>
       </w:pPr>
       <w:r>
+        <w:t xml:space="preserve">4. Instalación automática (recomendado)</w:t>
+      </w:r>
+    </w:p>
+    <w:p>
+      <w:pPr>
+        <w:pStyle w:val="Listaconvietas"/>
+      </w:pPr>
+      <w:r>
         <w:t xml:space="preserve">4. Actualización del </w:t>
       </w:r>
       <w:r>
@@ -1640,6 +1648,147 @@
           <w:sz w:val="20"/>
         </w:rPr>
         <w:t xml:space="preserve"> | ssh brumelab@brumexa.local "mkdir -p ~/.ssh &amp;&amp; cat &gt;&gt; ~/.ssh/authorized_keys"</w:t>
+      </w:r>
+    </w:p>
+    <w:p>
+      <w:pPr>
+        <w:pStyle w:val="Ttulo1"/>
+      </w:pPr>
+      <w:r>
+        <w:t xml:space="preserve">4. Instalación automática (recomendado)</w:t>
+      </w:r>
+    </w:p>
+    <w:p>
+      <w:pPr>
+        <w:jc w:val="center"/>
+        <w:rPr>
+          <w:lang w:val="es-AR"/>
+        </w:rPr>
+      </w:pPr>
+      <w:r>
+        <w:t xml:space="preserve">Una vez conectado por SSH, correr este único comando:</w:t>
+      </w:r>
+    </w:p>
+    <w:p>
+      <w:pPr>
+        <w:jc w:val="center"/>
+        <w:rPr>
+          <w:lang w:val="es-AR"/>
+        </w:rPr>
+      </w:pPr>
+      <w:r>
+        <w:t xml:space="preserve">curl -fsSL https://raw.githubusercontent.com/cminnelli/brumexa-edge/main/install.sh | bash</w:t>
+      </w:r>
+    </w:p>
+    <w:p>
+      <w:pPr>
+        <w:jc w:val="center"/>
+        <w:rPr>
+          <w:lang w:val="es-AR"/>
+        </w:rPr>
+      </w:pPr>
+      <w:r>
+        <w:t xml:space="preserve">El script hace todo automáticamente:</w:t>
+      </w:r>
+    </w:p>
+    <w:p>
+      <w:pPr>
+        <w:pStyle w:val="Listaconvietas"/>
+      </w:pPr>
+      <w:r>
+        <w:t xml:space="preserve">Actualiza el sistema operativo</w:t>
+      </w:r>
+    </w:p>
+    <w:p>
+      <w:pPr>
+        <w:pStyle w:val="Listaconvietas"/>
+      </w:pPr>
+      <w:r>
+        <w:t xml:space="preserve">Instala Node.js 20, Git, alsa-utils, bluez, network-manager</w:t>
+      </w:r>
+    </w:p>
+    <w:p>
+      <w:pPr>
+        <w:pStyle w:val="Listaconvietas"/>
+      </w:pPr>
+      <w:r>
+        <w:t xml:space="preserve">Clona el repositorio brumexa-edge en ~/proyectos/brumexa-edge</w:t>
+      </w:r>
+    </w:p>
+    <w:p>
+      <w:pPr>
+        <w:pStyle w:val="Listaconvietas"/>
+      </w:pPr>
+      <w:r>
+        <w:t xml:space="preserve">Ejecuta npm install (puede tardar 3-5 min en Pi Zero 2W)</w:t>
+      </w:r>
+    </w:p>
+    <w:p>
+      <w:pPr>
+        <w:pStyle w:val="Listaconvietas"/>
+      </w:pPr>
+      <w:r>
+        <w:t xml:space="preserve">Instala la librería NeoPixel (rpi-ws281x-native)</w:t>
+      </w:r>
+    </w:p>
+    <w:p>
+      <w:pPr>
+        <w:pStyle w:val="Listaconvietas"/>
+      </w:pPr>
+      <w:r>
+        <w:t xml:space="preserve">Pide interactivamente TOKEN_API_URL y BRUMEXA_API_KEY para el .env</w:t>
+      </w:r>
+    </w:p>
+    <w:p>
+      <w:pPr>
+        <w:pStyle w:val="Listaconvietas"/>
+      </w:pPr>
+      <w:r>
+        <w:t xml:space="preserve">Pregunta si configurar arranque automático al boot con PM2</w:t>
+      </w:r>
+    </w:p>
+    <w:p>
+      <w:pPr>
+        <w:jc w:val="center"/>
+        <w:rPr>
+          <w:lang w:val="es-AR"/>
+        </w:rPr>
+      </w:pPr>
+      <w:r>
+        <w:t xml:space="preserve">Al terminar, arrancar el servidor manualmente:</w:t>
+      </w:r>
+    </w:p>
+    <w:p>
+      <w:pPr>
+        <w:jc w:val="center"/>
+        <w:rPr>
+          <w:lang w:val="es-AR"/>
+        </w:rPr>
+      </w:pPr>
+      <w:r>
+        <w:t xml:space="preserve">cd ~/proyectos/brumexa-edge &amp;&amp; node server.js</w:t>
+      </w:r>
+    </w:p>
+    <w:p>
+      <w:pPr>
+        <w:jc w:val="center"/>
+        <w:rPr>
+          <w:lang w:val="es-AR"/>
+        </w:rPr>
+      </w:pPr>
+      <w:r>
+        <w:t xml:space="preserve">O si se eligió PM2, el servidor arranca solo al boot sin hacer nada más.</w:t>
+      </w:r>
+    </w:p>
+    <w:p>
+      <w:pPr>
+        <w:jc w:val="center"/>
+        <w:rPr>
+          <w:lang w:val="es-AR"/>
+        </w:rPr>
+      </w:pPr>
+      <w:r>
+        <w:t xml:space="preserve">ℹ  Las secciones 4 a 9 del instructivo quedan cubiertas por este script. Continuar desde la sección 10 (Cableado).</w:t>
       </w:r>
     </w:p>
     <w:p>
@@ -3495,6 +3644,410 @@
           <w:lang w:val="es-AR"/>
         </w:rPr>
         <w:t>ssh brumelab@brumexa.local</w:t>
+      </w:r>
+    </w:p>
+    <w:p>
+      <w:pPr>
+        <w:pStyle w:val="Ttulo2"/>
+      </w:pPr>
+      <w:r>
+        <w:t xml:space="preserve">Archivo config.txt completo (referencia)</w:t>
+      </w:r>
+    </w:p>
+    <w:p>
+      <w:pPr>
+        <w:jc w:val="center"/>
+        <w:rPr>
+          <w:lang w:val="es-AR"/>
+        </w:rPr>
+      </w:pPr>
+      <w:r>
+        <w:t xml:space="preserve">Copiar y pegar en /boot/firmware/config.txt al final, reemplazando el contenido existente:</w:t>
+      </w:r>
+    </w:p>
+    <w:p>
+      <w:pPr>
+        <w:jc w:val="center"/>
+        <w:rPr>
+          <w:lang w:val="es-AR"/>
+        </w:rPr>
+      </w:pPr>
+      <w:r>
+        <w:t xml:space="preserve"># For more options and information see http://rptl.io/configtxt</w:t>
+      </w:r>
+    </w:p>
+    <w:p>
+      <w:pPr>
+        <w:jc w:val="center"/>
+        <w:rPr>
+          <w:lang w:val="es-AR"/>
+        </w:rPr>
+      </w:pPr>
+      <w:r>
+        <w:t xml:space="preserve"/>
+      </w:r>
+    </w:p>
+    <w:p>
+      <w:pPr>
+        <w:jc w:val="center"/>
+        <w:rPr>
+          <w:lang w:val="es-AR"/>
+        </w:rPr>
+      </w:pPr>
+      <w:r>
+        <w:t xml:space="preserve"># Interfaces opcionales</w:t>
+      </w:r>
+    </w:p>
+    <w:p>
+      <w:pPr>
+        <w:jc w:val="center"/>
+        <w:rPr>
+          <w:lang w:val="es-AR"/>
+        </w:rPr>
+      </w:pPr>
+      <w:r>
+        <w:t xml:space="preserve">#dtparam=i2c_arm=on</w:t>
+      </w:r>
+    </w:p>
+    <w:p>
+      <w:pPr>
+        <w:jc w:val="center"/>
+        <w:rPr>
+          <w:lang w:val="es-AR"/>
+        </w:rPr>
+      </w:pPr>
+      <w:r>
+        <w:t xml:space="preserve">#dtparam=i2s=on</w:t>
+      </w:r>
+    </w:p>
+    <w:p>
+      <w:pPr>
+        <w:jc w:val="center"/>
+        <w:rPr>
+          <w:lang w:val="es-AR"/>
+        </w:rPr>
+      </w:pPr>
+      <w:r>
+        <w:t xml:space="preserve">#dtparam=spi=on</w:t>
+      </w:r>
+    </w:p>
+    <w:p>
+      <w:pPr>
+        <w:jc w:val="center"/>
+        <w:rPr>
+          <w:lang w:val="es-AR"/>
+        </w:rPr>
+      </w:pPr>
+      <w:r>
+        <w:t xml:space="preserve"/>
+      </w:r>
+    </w:p>
+    <w:p>
+      <w:pPr>
+        <w:jc w:val="center"/>
+        <w:rPr>
+          <w:lang w:val="es-AR"/>
+        </w:rPr>
+      </w:pPr>
+      <w:r>
+        <w:t xml:space="preserve"># Audio onboard (no usar con I2S)</w:t>
+      </w:r>
+    </w:p>
+    <w:p>
+      <w:pPr>
+        <w:jc w:val="center"/>
+        <w:rPr>
+          <w:lang w:val="es-AR"/>
+        </w:rPr>
+      </w:pPr>
+      <w:r>
+        <w:t xml:space="preserve">dtparam=audio=on</w:t>
+      </w:r>
+    </w:p>
+    <w:p>
+      <w:pPr>
+        <w:jc w:val="center"/>
+        <w:rPr>
+          <w:lang w:val="es-AR"/>
+        </w:rPr>
+      </w:pPr>
+      <w:r>
+        <w:t xml:space="preserve"/>
+      </w:r>
+    </w:p>
+    <w:p>
+      <w:pPr>
+        <w:jc w:val="center"/>
+        <w:rPr>
+          <w:lang w:val="es-AR"/>
+        </w:rPr>
+      </w:pPr>
+      <w:r>
+        <w:t xml:space="preserve">camera_auto_detect=1</w:t>
+      </w:r>
+    </w:p>
+    <w:p>
+      <w:pPr>
+        <w:jc w:val="center"/>
+        <w:rPr>
+          <w:lang w:val="es-AR"/>
+        </w:rPr>
+      </w:pPr>
+      <w:r>
+        <w:t xml:space="preserve">display_auto_detect=1</w:t>
+      </w:r>
+    </w:p>
+    <w:p>
+      <w:pPr>
+        <w:jc w:val="center"/>
+        <w:rPr>
+          <w:lang w:val="es-AR"/>
+        </w:rPr>
+      </w:pPr>
+      <w:r>
+        <w:t xml:space="preserve">auto_initramfs=1</w:t>
+      </w:r>
+    </w:p>
+    <w:p>
+      <w:pPr>
+        <w:jc w:val="center"/>
+        <w:rPr>
+          <w:lang w:val="es-AR"/>
+        </w:rPr>
+      </w:pPr>
+      <w:r>
+        <w:t xml:space="preserve">dtoverlay=vc4-kms-v3d</w:t>
+      </w:r>
+    </w:p>
+    <w:p>
+      <w:pPr>
+        <w:jc w:val="center"/>
+        <w:rPr>
+          <w:lang w:val="es-AR"/>
+        </w:rPr>
+      </w:pPr>
+      <w:r>
+        <w:t xml:space="preserve">max_framebuffers=2</w:t>
+      </w:r>
+    </w:p>
+    <w:p>
+      <w:pPr>
+        <w:jc w:val="center"/>
+        <w:rPr>
+          <w:lang w:val="es-AR"/>
+        </w:rPr>
+      </w:pPr>
+      <w:r>
+        <w:t xml:space="preserve">disable_fw_kms_setup=1</w:t>
+      </w:r>
+    </w:p>
+    <w:p>
+      <w:pPr>
+        <w:jc w:val="center"/>
+        <w:rPr>
+          <w:lang w:val="es-AR"/>
+        </w:rPr>
+      </w:pPr>
+      <w:r>
+        <w:t xml:space="preserve">arm_64bit=1</w:t>
+      </w:r>
+    </w:p>
+    <w:p>
+      <w:pPr>
+        <w:jc w:val="center"/>
+        <w:rPr>
+          <w:lang w:val="es-AR"/>
+        </w:rPr>
+      </w:pPr>
+      <w:r>
+        <w:t xml:space="preserve">disable_overscan=1</w:t>
+      </w:r>
+    </w:p>
+    <w:p>
+      <w:pPr>
+        <w:jc w:val="center"/>
+        <w:rPr>
+          <w:lang w:val="es-AR"/>
+        </w:rPr>
+      </w:pPr>
+      <w:r>
+        <w:t xml:space="preserve">arm_boost=1</w:t>
+      </w:r>
+    </w:p>
+    <w:p>
+      <w:pPr>
+        <w:jc w:val="center"/>
+        <w:rPr>
+          <w:lang w:val="es-AR"/>
+        </w:rPr>
+      </w:pPr>
+      <w:r>
+        <w:t xml:space="preserve"/>
+      </w:r>
+    </w:p>
+    <w:p>
+      <w:pPr>
+        <w:jc w:val="center"/>
+        <w:rPr>
+          <w:lang w:val="es-AR"/>
+        </w:rPr>
+      </w:pPr>
+      <w:r>
+        <w:t xml:space="preserve">[cm4]</w:t>
+      </w:r>
+    </w:p>
+    <w:p>
+      <w:pPr>
+        <w:jc w:val="center"/>
+        <w:rPr>
+          <w:lang w:val="es-AR"/>
+        </w:rPr>
+      </w:pPr>
+      <w:r>
+        <w:t xml:space="preserve">otg_mode=1</w:t>
+      </w:r>
+    </w:p>
+    <w:p>
+      <w:pPr>
+        <w:jc w:val="center"/>
+        <w:rPr>
+          <w:lang w:val="es-AR"/>
+        </w:rPr>
+      </w:pPr>
+      <w:r>
+        <w:t xml:space="preserve"/>
+      </w:r>
+    </w:p>
+    <w:p>
+      <w:pPr>
+        <w:jc w:val="center"/>
+        <w:rPr>
+          <w:lang w:val="es-AR"/>
+        </w:rPr>
+      </w:pPr>
+      <w:r>
+        <w:t xml:space="preserve">[cm5]</w:t>
+      </w:r>
+    </w:p>
+    <w:p>
+      <w:pPr>
+        <w:jc w:val="center"/>
+        <w:rPr>
+          <w:lang w:val="es-AR"/>
+        </w:rPr>
+      </w:pPr>
+      <w:r>
+        <w:t xml:space="preserve">dtoverlay=dwc2,dr_mode=host</w:t>
+      </w:r>
+    </w:p>
+    <w:p>
+      <w:pPr>
+        <w:jc w:val="center"/>
+        <w:rPr>
+          <w:lang w:val="es-AR"/>
+        </w:rPr>
+      </w:pPr>
+      <w:r>
+        <w:t xml:space="preserve"/>
+      </w:r>
+    </w:p>
+    <w:p>
+      <w:pPr>
+        <w:jc w:val="center"/>
+        <w:rPr>
+          <w:lang w:val="es-AR"/>
+        </w:rPr>
+      </w:pPr>
+      <w:r>
+        <w:t xml:space="preserve">[all]</w:t>
+      </w:r>
+    </w:p>
+    <w:p>
+      <w:pPr>
+        <w:jc w:val="center"/>
+        <w:rPr>
+          <w:lang w:val="es-AR"/>
+        </w:rPr>
+      </w:pPr>
+      <w:r>
+        <w:t xml:space="preserve">enable_uart=1</w:t>
+      </w:r>
+    </w:p>
+    <w:p>
+      <w:pPr>
+        <w:jc w:val="center"/>
+        <w:rPr>
+          <w:lang w:val="es-AR"/>
+        </w:rPr>
+      </w:pPr>
+      <w:r>
+        <w:t xml:space="preserve"/>
+      </w:r>
+    </w:p>
+    <w:p>
+      <w:pPr>
+        <w:jc w:val="center"/>
+        <w:rPr>
+          <w:lang w:val="es-AR"/>
+        </w:rPr>
+      </w:pPr>
+      <w:r>
+        <w:t xml:space="preserve"># Audio I2S (mic INMP441 + speaker MAX98357A)</w:t>
+      </w:r>
+    </w:p>
+    <w:p>
+      <w:pPr>
+        <w:jc w:val="center"/>
+        <w:rPr>
+          <w:lang w:val="es-AR"/>
+        </w:rPr>
+      </w:pPr>
+      <w:r>
+        <w:t xml:space="preserve">dtparam=i2s=on</w:t>
+      </w:r>
+    </w:p>
+    <w:p>
+      <w:pPr>
+        <w:jc w:val="center"/>
+        <w:rPr>
+          <w:lang w:val="es-AR"/>
+        </w:rPr>
+      </w:pPr>
+      <w:r>
+        <w:t xml:space="preserve">dtoverlay=googlevoicehat-soundcard</w:t>
+      </w:r>
+    </w:p>
+    <w:p>
+      <w:pPr>
+        <w:jc w:val="center"/>
+        <w:rPr>
+          <w:lang w:val="es-AR"/>
+        </w:rPr>
+      </w:pPr>
+      <w:r>
+        <w:t xml:space="preserve"/>
+      </w:r>
+    </w:p>
+    <w:p>
+      <w:pPr>
+        <w:jc w:val="center"/>
+        <w:rPr>
+          <w:lang w:val="es-AR"/>
+        </w:rPr>
+      </w:pPr>
+      <w:r>
+        <w:t xml:space="preserve"># NeoPixel WS2812 (GPIO 10 SPI MOSI)</w:t>
+      </w:r>
+    </w:p>
+    <w:p>
+      <w:pPr>
+        <w:jc w:val="center"/>
+        <w:rPr>
+          <w:lang w:val="es-AR"/>
+        </w:rPr>
+      </w:pPr>
+      <w:r>
+        <w:t xml:space="preserve">dtparam=spi=on</w:t>
       </w:r>
     </w:p>
     <w:p>

</xml_diff>